<commit_message>
feat: replace Car2DB with NHTSA vPIC adapter
</commit_message>
<xml_diff>
--- a/docs/Enthusiast_Lens_V1_Schema_and_Eval_Spec.docx
+++ b/docs/Enthusiast_Lens_V1_Schema_and_Eval_Spec.docx
@@ -5911,7 +5911,7 @@
           </w:tcPr>
           <w:p>
             <w:r>
-              <w:t>Car2DB structured / targeted web / manufacturer / instrumented test / derived.</w:t>
+              <w:t>NHTSA vPIC structured / targeted web / manufacturer / instrumented test / derived.</w:t>
             </w:r>
           </w:p>
         </w:tc>
@@ -6567,7 +6567,7 @@
         <w:pStyle w:val="ListBullet"/>
       </w:pPr>
       <w:r>
-        <w:t>Ground truth must be independently sourced; Car2DB is not allowed to define the answer key because it is part of the Hybrid system being evaluated.</w:t>
+        <w:t>Ground truth must be independently sourced; NHTSA vPIC is not allowed to define the answer key because it is part of the Hybrid system being evaluated. In Hybrid mode, exact-VIN NHTSA vPIC data is manufacturer-reported structured seed data; blank or missing vPIC values mean Unknown, not feature absence, and targeted agent research addresses missing, ambiguous, and configuration-sensitive enthusiast facts.</w:t>
       </w:r>
     </w:p>
     <w:p>

</xml_diff>